<commit_message>
Alteração no arquivo guia missão
</commit_message>
<xml_diff>
--- a/27082026/Missão GIT.docx
+++ b/27082026/Missão GIT.docx
@@ -503,7 +503,289 @@
           <w:sz w:val="24"/>
           <w:szCs w:val="24"/>
         </w:rPr>
-        <w:t>3. Comandos Úteis para Navegação e Gerenciamento</w:t>
+        <w:t>3. Unificando as Alterações (Fluxo de Merge)</w:t>
+      </w:r>
+    </w:p>
+    <w:p>
+      <w:pPr>
+        <w:pStyle w:val="NormalWeb"/>
+      </w:pPr>
+      <w:r>
+        <w:t xml:space="preserve">Após finalizar o código na </w:t>
+      </w:r>
+      <w:proofErr w:type="spellStart"/>
+      <w:r>
+        <w:t>branch</w:t>
+      </w:r>
+      <w:proofErr w:type="spellEnd"/>
+      <w:r>
+        <w:t xml:space="preserve"> de </w:t>
+      </w:r>
+      <w:r>
+        <w:rPr>
+          <w:b/>
+          <w:bCs/>
+        </w:rPr>
+        <w:t>desenvolvimento</w:t>
+      </w:r>
+      <w:r>
+        <w:t xml:space="preserve">, você deve promover suas alterações subindo primeiro para </w:t>
+      </w:r>
+      <w:r>
+        <w:rPr>
+          <w:b/>
+          <w:bCs/>
+        </w:rPr>
+        <w:t>homologação</w:t>
+      </w:r>
+      <w:r>
+        <w:t xml:space="preserve"> (para testes) e depois para a sua </w:t>
+      </w:r>
+      <w:proofErr w:type="spellStart"/>
+      <w:r>
+        <w:rPr>
+          <w:b/>
+          <w:bCs/>
+        </w:rPr>
+        <w:t>main</w:t>
+      </w:r>
+      <w:proofErr w:type="spellEnd"/>
+      <w:r>
+        <w:t xml:space="preserve"> (versão final).</w:t>
+      </w:r>
+    </w:p>
+    <w:p>
+      <w:pPr>
+        <w:pStyle w:val="Ttulo4"/>
+      </w:pPr>
+      <w:r>
+        <w:t>Passo A: Enviar de Desenvolvimento para Homologação</w:t>
+      </w:r>
+    </w:p>
+    <w:p>
+      <w:pPr>
+        <w:pStyle w:val="NormalWeb"/>
+        <w:numPr>
+          <w:ilvl w:val="0"/>
+          <w:numId w:val="2"/>
+        </w:numPr>
+      </w:pPr>
+      <w:r>
+        <w:t xml:space="preserve">Mude para a </w:t>
+      </w:r>
+      <w:proofErr w:type="spellStart"/>
+      <w:r>
+        <w:t>branch</w:t>
+      </w:r>
+      <w:proofErr w:type="spellEnd"/>
+      <w:r>
+        <w:t xml:space="preserve"> de homologação: "</w:t>
+      </w:r>
+      <w:proofErr w:type="spellStart"/>
+      <w:r>
+        <w:rPr>
+          <w:b/>
+          <w:bCs/>
+        </w:rPr>
+        <w:t>git</w:t>
+      </w:r>
+      <w:proofErr w:type="spellEnd"/>
+      <w:r>
+        <w:rPr>
+          <w:b/>
+          <w:bCs/>
+        </w:rPr>
+        <w:t xml:space="preserve"> checkout </w:t>
+      </w:r>
+      <w:proofErr w:type="spellStart"/>
+      <w:r>
+        <w:rPr>
+          <w:b/>
+          <w:bCs/>
+        </w:rPr>
+        <w:t>homologacao</w:t>
+      </w:r>
+      <w:proofErr w:type="spellEnd"/>
+      <w:r>
+        <w:rPr>
+          <w:b/>
+          <w:bCs/>
+        </w:rPr>
+        <w:t>-SUA_MATRICULA</w:t>
+      </w:r>
+      <w:r>
+        <w:t>"</w:t>
+      </w:r>
+    </w:p>
+    <w:p>
+      <w:pPr>
+        <w:pStyle w:val="NormalWeb"/>
+        <w:numPr>
+          <w:ilvl w:val="0"/>
+          <w:numId w:val="2"/>
+        </w:numPr>
+      </w:pPr>
+      <w:r>
+        <w:t>Junte o código desenvolvido: "</w:t>
+      </w:r>
+      <w:proofErr w:type="spellStart"/>
+      <w:r>
+        <w:rPr>
+          <w:b/>
+          <w:bCs/>
+        </w:rPr>
+        <w:t>git</w:t>
+      </w:r>
+      <w:proofErr w:type="spellEnd"/>
+      <w:r>
+        <w:rPr>
+          <w:b/>
+          <w:bCs/>
+        </w:rPr>
+        <w:t xml:space="preserve"> merge desenvolvimento-SUA_MATRICULA</w:t>
+      </w:r>
+      <w:r>
+        <w:t>"</w:t>
+      </w:r>
+    </w:p>
+    <w:p>
+      <w:pPr>
+        <w:pStyle w:val="Ttulo4"/>
+      </w:pPr>
+      <w:r>
+        <w:t xml:space="preserve">Passo B: Enviar de Homologação para a </w:t>
+      </w:r>
+      <w:proofErr w:type="spellStart"/>
+      <w:r>
+        <w:t>Main</w:t>
+      </w:r>
+      <w:proofErr w:type="spellEnd"/>
+    </w:p>
+    <w:p>
+      <w:pPr>
+        <w:pStyle w:val="NormalWeb"/>
+        <w:numPr>
+          <w:ilvl w:val="0"/>
+          <w:numId w:val="3"/>
+        </w:numPr>
+      </w:pPr>
+      <w:r>
+        <w:t xml:space="preserve">Mude para a sua </w:t>
+      </w:r>
+      <w:proofErr w:type="spellStart"/>
+      <w:r>
+        <w:t>branch</w:t>
+      </w:r>
+      <w:proofErr w:type="spellEnd"/>
+      <w:r>
+        <w:t xml:space="preserve"> </w:t>
+      </w:r>
+      <w:proofErr w:type="spellStart"/>
+      <w:r>
+        <w:t>main</w:t>
+      </w:r>
+      <w:proofErr w:type="spellEnd"/>
+      <w:r>
+        <w:t>: "</w:t>
+      </w:r>
+      <w:proofErr w:type="spellStart"/>
+      <w:r>
+        <w:rPr>
+          <w:b/>
+          <w:bCs/>
+        </w:rPr>
+        <w:t>git</w:t>
+      </w:r>
+      <w:proofErr w:type="spellEnd"/>
+      <w:r>
+        <w:rPr>
+          <w:b/>
+          <w:bCs/>
+        </w:rPr>
+        <w:t xml:space="preserve"> checkout </w:t>
+      </w:r>
+      <w:proofErr w:type="spellStart"/>
+      <w:r>
+        <w:rPr>
+          <w:b/>
+          <w:bCs/>
+        </w:rPr>
+        <w:t>main</w:t>
+      </w:r>
+      <w:proofErr w:type="spellEnd"/>
+      <w:r>
+        <w:rPr>
+          <w:b/>
+          <w:bCs/>
+        </w:rPr>
+        <w:t>-SUA_MATRICULA</w:t>
+      </w:r>
+      <w:r>
+        <w:t>"</w:t>
+      </w:r>
+    </w:p>
+    <w:p>
+      <w:pPr>
+        <w:pStyle w:val="NormalWeb"/>
+        <w:numPr>
+          <w:ilvl w:val="0"/>
+          <w:numId w:val="3"/>
+        </w:numPr>
+      </w:pPr>
+      <w:r>
+        <w:lastRenderedPageBreak/>
+        <w:t>Junte o código testado: "</w:t>
+      </w:r>
+      <w:proofErr w:type="spellStart"/>
+      <w:r>
+        <w:rPr>
+          <w:b/>
+          <w:bCs/>
+        </w:rPr>
+        <w:t>git</w:t>
+      </w:r>
+      <w:proofErr w:type="spellEnd"/>
+      <w:r>
+        <w:rPr>
+          <w:b/>
+          <w:bCs/>
+        </w:rPr>
+        <w:t xml:space="preserve"> merge </w:t>
+      </w:r>
+      <w:proofErr w:type="spellStart"/>
+      <w:r>
+        <w:rPr>
+          <w:b/>
+          <w:bCs/>
+        </w:rPr>
+        <w:t>homologacao</w:t>
+      </w:r>
+      <w:proofErr w:type="spellEnd"/>
+      <w:r>
+        <w:rPr>
+          <w:b/>
+          <w:bCs/>
+        </w:rPr>
+        <w:t>-SUA_MATRICULA</w:t>
+      </w:r>
+      <w:r>
+        <w:t>"</w:t>
+      </w:r>
+    </w:p>
+    <w:p>
+      <w:pPr>
+        <w:pStyle w:val="Ttulo3"/>
+        <w:rPr>
+          <w:sz w:val="24"/>
+          <w:szCs w:val="24"/>
+        </w:rPr>
+      </w:pPr>
+      <w:r>
+        <w:rPr>
+          <w:sz w:val="24"/>
+          <w:szCs w:val="24"/>
+        </w:rPr>
+        <w:t>4. Comandos Úteis para Navegação e Gerenciamento</w:t>
       </w:r>
     </w:p>
     <w:p>
@@ -699,7 +981,6 @@
         <w:pStyle w:val="NormalWeb"/>
       </w:pPr>
       <w:r>
-        <w:lastRenderedPageBreak/>
         <w:t xml:space="preserve">Para excluir uma </w:t>
       </w:r>
       <w:proofErr w:type="spellStart"/>
@@ -735,7 +1016,7 @@
         <w:pStyle w:val="NormalWeb"/>
         <w:numPr>
           <w:ilvl w:val="0"/>
-          <w:numId w:val="1"/>
+          <w:numId w:val="4"/>
         </w:numPr>
       </w:pPr>
       <w:r>
@@ -774,7 +1055,7 @@
         <w:pStyle w:val="NormalWeb"/>
         <w:numPr>
           <w:ilvl w:val="0"/>
-          <w:numId w:val="1"/>
+          <w:numId w:val="4"/>
         </w:numPr>
       </w:pPr>
       <w:r>
@@ -971,14 +1252,6 @@
       <w:r>
         <w:t>"</w:t>
       </w:r>
-    </w:p>
-    <w:p>
-      <w:pPr>
-        <w:rPr>
-          <w:sz w:val="24"/>
-          <w:szCs w:val="24"/>
-        </w:rPr>
-      </w:pPr>
     </w:p>
     <w:sectPr>
       <w:pgSz w:w="11906" w:h="16838"/>
@@ -993,6 +1266,345 @@
 <file path=word/numbering.xml><?xml version="1.0" encoding="utf-8"?>
 <w:numbering xmlns:wpc="http://schemas.microsoft.com/office/word/2010/wordprocessingCanvas" xmlns:cx="http://schemas.microsoft.com/office/drawing/2014/chartex" xmlns:cx1="http://schemas.microsoft.com/office/drawing/2015/9/8/chartex" xmlns:cx2="http://schemas.microsoft.com/office/drawing/2015/10/21/chartex" xmlns:cx3="http://schemas.microsoft.com/office/drawing/2016/5/9/chartex" xmlns:cx4="http://schemas.microsoft.com/office/drawing/2016/5/10/chartex" xmlns:cx5="http://schemas.microsoft.com/office/drawing/2016/5/11/chartex" xmlns:cx6="http://schemas.microsoft.com/office/drawing/2016/5/12/chartex" xmlns:cx7="http://schemas.microsoft.com/office/drawing/2016/5/13/chartex" xmlns:cx8="http://schemas.microsoft.com/office/drawing/2016/5/14/chartex" xmlns:mc="http://schemas.openxmlformats.org/markup-compatibility/2006" xmlns:aink="http://schemas.microsoft.com/office/drawing/2016/ink" xmlns:am3d="http://schemas.microsoft.com/office/drawing/2017/model3d" xmlns:o="urn:schemas-microsoft-com:office:office" xmlns:r="http://schemas.openxmlformats.org/officeDocument/2006/relationships" xmlns:m="http://schemas.openxmlformats.org/officeDocument/2006/math" xmlns:v="urn:schemas-microsoft-com:vml" xmlns:wp14="http://schemas.microsoft.com/office/word/2010/wordprocessingDrawing" xmlns:wp="http://schemas.openxmlformats.org/drawingml/2006/wordprocessingDrawing" xmlns:w10="urn:schemas-microsoft-com:office:word" xmlns:w="http://schemas.openxmlformats.org/wordprocessingml/2006/main" xmlns:w14="http://schemas.microsoft.com/office/word/2010/wordml" xmlns:w15="http://schemas.microsoft.com/office/word/2012/wordml" xmlns:w16cex="http://schemas.microsoft.com/office/word/2018/wordml/cex" xmlns:w16cid="http://schemas.microsoft.com/office/word/2016/wordml/cid" xmlns:w16="http://schemas.microsoft.com/office/word/2018/wordml" xmlns:w16sdtdh="http://schemas.microsoft.com/office/word/2020/wordml/sdtdatahash" xmlns:w16se="http://schemas.microsoft.com/office/word/2015/wordml/symex" xmlns:wpg="http://schemas.microsoft.com/office/word/2010/wordprocessingGroup" xmlns:wpi="http://schemas.microsoft.com/office/word/2010/wordprocessingInk" xmlns:wne="http://schemas.microsoft.com/office/word/2006/wordml" xmlns:wps="http://schemas.microsoft.com/office/word/2010/wordprocessingShape" mc:Ignorable="w14 w15 w16se w16cid w16 w16cex w16sdtdh wp14">
   <w:abstractNum w:abstractNumId="0" w15:restartNumberingAfterBreak="0">
+    <w:nsid w:val="0F8761C8"/>
+    <w:multiLevelType w:val="multilevel"/>
+    <w:tmpl w:val="035A1612"/>
+    <w:lvl w:ilvl="0">
+      <w:start w:val="1"/>
+      <w:numFmt w:val="decimal"/>
+      <w:lvlText w:val="%1."/>
+      <w:lvlJc w:val="left"/>
+      <w:pPr>
+        <w:tabs>
+          <w:tab w:val="num" w:pos="720"/>
+        </w:tabs>
+        <w:ind w:left="720" w:hanging="360"/>
+      </w:pPr>
+    </w:lvl>
+    <w:lvl w:ilvl="1" w:tentative="1">
+      <w:start w:val="1"/>
+      <w:numFmt w:val="decimal"/>
+      <w:lvlText w:val="%2."/>
+      <w:lvlJc w:val="left"/>
+      <w:pPr>
+        <w:tabs>
+          <w:tab w:val="num" w:pos="1440"/>
+        </w:tabs>
+        <w:ind w:left="1440" w:hanging="360"/>
+      </w:pPr>
+    </w:lvl>
+    <w:lvl w:ilvl="2" w:tentative="1">
+      <w:start w:val="1"/>
+      <w:numFmt w:val="decimal"/>
+      <w:lvlText w:val="%3."/>
+      <w:lvlJc w:val="left"/>
+      <w:pPr>
+        <w:tabs>
+          <w:tab w:val="num" w:pos="2160"/>
+        </w:tabs>
+        <w:ind w:left="2160" w:hanging="360"/>
+      </w:pPr>
+    </w:lvl>
+    <w:lvl w:ilvl="3" w:tentative="1">
+      <w:start w:val="1"/>
+      <w:numFmt w:val="decimal"/>
+      <w:lvlText w:val="%4."/>
+      <w:lvlJc w:val="left"/>
+      <w:pPr>
+        <w:tabs>
+          <w:tab w:val="num" w:pos="2880"/>
+        </w:tabs>
+        <w:ind w:left="2880" w:hanging="360"/>
+      </w:pPr>
+    </w:lvl>
+    <w:lvl w:ilvl="4" w:tentative="1">
+      <w:start w:val="1"/>
+      <w:numFmt w:val="decimal"/>
+      <w:lvlText w:val="%5."/>
+      <w:lvlJc w:val="left"/>
+      <w:pPr>
+        <w:tabs>
+          <w:tab w:val="num" w:pos="3600"/>
+        </w:tabs>
+        <w:ind w:left="3600" w:hanging="360"/>
+      </w:pPr>
+    </w:lvl>
+    <w:lvl w:ilvl="5" w:tentative="1">
+      <w:start w:val="1"/>
+      <w:numFmt w:val="decimal"/>
+      <w:lvlText w:val="%6."/>
+      <w:lvlJc w:val="left"/>
+      <w:pPr>
+        <w:tabs>
+          <w:tab w:val="num" w:pos="4320"/>
+        </w:tabs>
+        <w:ind w:left="4320" w:hanging="360"/>
+      </w:pPr>
+    </w:lvl>
+    <w:lvl w:ilvl="6" w:tentative="1">
+      <w:start w:val="1"/>
+      <w:numFmt w:val="decimal"/>
+      <w:lvlText w:val="%7."/>
+      <w:lvlJc w:val="left"/>
+      <w:pPr>
+        <w:tabs>
+          <w:tab w:val="num" w:pos="5040"/>
+        </w:tabs>
+        <w:ind w:left="5040" w:hanging="360"/>
+      </w:pPr>
+    </w:lvl>
+    <w:lvl w:ilvl="7" w:tentative="1">
+      <w:start w:val="1"/>
+      <w:numFmt w:val="decimal"/>
+      <w:lvlText w:val="%8."/>
+      <w:lvlJc w:val="left"/>
+      <w:pPr>
+        <w:tabs>
+          <w:tab w:val="num" w:pos="5760"/>
+        </w:tabs>
+        <w:ind w:left="5760" w:hanging="360"/>
+      </w:pPr>
+    </w:lvl>
+    <w:lvl w:ilvl="8" w:tentative="1">
+      <w:start w:val="1"/>
+      <w:numFmt w:val="decimal"/>
+      <w:lvlText w:val="%9."/>
+      <w:lvlJc w:val="left"/>
+      <w:pPr>
+        <w:tabs>
+          <w:tab w:val="num" w:pos="6480"/>
+        </w:tabs>
+        <w:ind w:left="6480" w:hanging="360"/>
+      </w:pPr>
+    </w:lvl>
+  </w:abstractNum>
+  <w:abstractNum w:abstractNumId="1" w15:restartNumberingAfterBreak="0">
+    <w:nsid w:val="12C3019A"/>
+    <w:multiLevelType w:val="multilevel"/>
+    <w:tmpl w:val="2FC0423E"/>
+    <w:lvl w:ilvl="0">
+      <w:start w:val="1"/>
+      <w:numFmt w:val="decimal"/>
+      <w:lvlText w:val="%1."/>
+      <w:lvlJc w:val="left"/>
+      <w:pPr>
+        <w:tabs>
+          <w:tab w:val="num" w:pos="720"/>
+        </w:tabs>
+        <w:ind w:left="720" w:hanging="360"/>
+      </w:pPr>
+    </w:lvl>
+    <w:lvl w:ilvl="1" w:tentative="1">
+      <w:start w:val="1"/>
+      <w:numFmt w:val="decimal"/>
+      <w:lvlText w:val="%2."/>
+      <w:lvlJc w:val="left"/>
+      <w:pPr>
+        <w:tabs>
+          <w:tab w:val="num" w:pos="1440"/>
+        </w:tabs>
+        <w:ind w:left="1440" w:hanging="360"/>
+      </w:pPr>
+    </w:lvl>
+    <w:lvl w:ilvl="2" w:tentative="1">
+      <w:start w:val="1"/>
+      <w:numFmt w:val="decimal"/>
+      <w:lvlText w:val="%3."/>
+      <w:lvlJc w:val="left"/>
+      <w:pPr>
+        <w:tabs>
+          <w:tab w:val="num" w:pos="2160"/>
+        </w:tabs>
+        <w:ind w:left="2160" w:hanging="360"/>
+      </w:pPr>
+    </w:lvl>
+    <w:lvl w:ilvl="3" w:tentative="1">
+      <w:start w:val="1"/>
+      <w:numFmt w:val="decimal"/>
+      <w:lvlText w:val="%4."/>
+      <w:lvlJc w:val="left"/>
+      <w:pPr>
+        <w:tabs>
+          <w:tab w:val="num" w:pos="2880"/>
+        </w:tabs>
+        <w:ind w:left="2880" w:hanging="360"/>
+      </w:pPr>
+    </w:lvl>
+    <w:lvl w:ilvl="4" w:tentative="1">
+      <w:start w:val="1"/>
+      <w:numFmt w:val="decimal"/>
+      <w:lvlText w:val="%5."/>
+      <w:lvlJc w:val="left"/>
+      <w:pPr>
+        <w:tabs>
+          <w:tab w:val="num" w:pos="3600"/>
+        </w:tabs>
+        <w:ind w:left="3600" w:hanging="360"/>
+      </w:pPr>
+    </w:lvl>
+    <w:lvl w:ilvl="5" w:tentative="1">
+      <w:start w:val="1"/>
+      <w:numFmt w:val="decimal"/>
+      <w:lvlText w:val="%6."/>
+      <w:lvlJc w:val="left"/>
+      <w:pPr>
+        <w:tabs>
+          <w:tab w:val="num" w:pos="4320"/>
+        </w:tabs>
+        <w:ind w:left="4320" w:hanging="360"/>
+      </w:pPr>
+    </w:lvl>
+    <w:lvl w:ilvl="6" w:tentative="1">
+      <w:start w:val="1"/>
+      <w:numFmt w:val="decimal"/>
+      <w:lvlText w:val="%7."/>
+      <w:lvlJc w:val="left"/>
+      <w:pPr>
+        <w:tabs>
+          <w:tab w:val="num" w:pos="5040"/>
+        </w:tabs>
+        <w:ind w:left="5040" w:hanging="360"/>
+      </w:pPr>
+    </w:lvl>
+    <w:lvl w:ilvl="7" w:tentative="1">
+      <w:start w:val="1"/>
+      <w:numFmt w:val="decimal"/>
+      <w:lvlText w:val="%8."/>
+      <w:lvlJc w:val="left"/>
+      <w:pPr>
+        <w:tabs>
+          <w:tab w:val="num" w:pos="5760"/>
+        </w:tabs>
+        <w:ind w:left="5760" w:hanging="360"/>
+      </w:pPr>
+    </w:lvl>
+    <w:lvl w:ilvl="8" w:tentative="1">
+      <w:start w:val="1"/>
+      <w:numFmt w:val="decimal"/>
+      <w:lvlText w:val="%9."/>
+      <w:lvlJc w:val="left"/>
+      <w:pPr>
+        <w:tabs>
+          <w:tab w:val="num" w:pos="6480"/>
+        </w:tabs>
+        <w:ind w:left="6480" w:hanging="360"/>
+      </w:pPr>
+    </w:lvl>
+  </w:abstractNum>
+  <w:abstractNum w:abstractNumId="2" w15:restartNumberingAfterBreak="0">
+    <w:nsid w:val="47920207"/>
+    <w:multiLevelType w:val="multilevel"/>
+    <w:tmpl w:val="F2F061CE"/>
+    <w:lvl w:ilvl="0">
+      <w:start w:val="1"/>
+      <w:numFmt w:val="decimal"/>
+      <w:lvlText w:val="%1."/>
+      <w:lvlJc w:val="left"/>
+      <w:pPr>
+        <w:tabs>
+          <w:tab w:val="num" w:pos="720"/>
+        </w:tabs>
+        <w:ind w:left="720" w:hanging="360"/>
+      </w:pPr>
+    </w:lvl>
+    <w:lvl w:ilvl="1" w:tentative="1">
+      <w:start w:val="1"/>
+      <w:numFmt w:val="decimal"/>
+      <w:lvlText w:val="%2."/>
+      <w:lvlJc w:val="left"/>
+      <w:pPr>
+        <w:tabs>
+          <w:tab w:val="num" w:pos="1440"/>
+        </w:tabs>
+        <w:ind w:left="1440" w:hanging="360"/>
+      </w:pPr>
+    </w:lvl>
+    <w:lvl w:ilvl="2" w:tentative="1">
+      <w:start w:val="1"/>
+      <w:numFmt w:val="decimal"/>
+      <w:lvlText w:val="%3."/>
+      <w:lvlJc w:val="left"/>
+      <w:pPr>
+        <w:tabs>
+          <w:tab w:val="num" w:pos="2160"/>
+        </w:tabs>
+        <w:ind w:left="2160" w:hanging="360"/>
+      </w:pPr>
+    </w:lvl>
+    <w:lvl w:ilvl="3" w:tentative="1">
+      <w:start w:val="1"/>
+      <w:numFmt w:val="decimal"/>
+      <w:lvlText w:val="%4."/>
+      <w:lvlJc w:val="left"/>
+      <w:pPr>
+        <w:tabs>
+          <w:tab w:val="num" w:pos="2880"/>
+        </w:tabs>
+        <w:ind w:left="2880" w:hanging="360"/>
+      </w:pPr>
+    </w:lvl>
+    <w:lvl w:ilvl="4" w:tentative="1">
+      <w:start w:val="1"/>
+      <w:numFmt w:val="decimal"/>
+      <w:lvlText w:val="%5."/>
+      <w:lvlJc w:val="left"/>
+      <w:pPr>
+        <w:tabs>
+          <w:tab w:val="num" w:pos="3600"/>
+        </w:tabs>
+        <w:ind w:left="3600" w:hanging="360"/>
+      </w:pPr>
+    </w:lvl>
+    <w:lvl w:ilvl="5" w:tentative="1">
+      <w:start w:val="1"/>
+      <w:numFmt w:val="decimal"/>
+      <w:lvlText w:val="%6."/>
+      <w:lvlJc w:val="left"/>
+      <w:pPr>
+        <w:tabs>
+          <w:tab w:val="num" w:pos="4320"/>
+        </w:tabs>
+        <w:ind w:left="4320" w:hanging="360"/>
+      </w:pPr>
+    </w:lvl>
+    <w:lvl w:ilvl="6" w:tentative="1">
+      <w:start w:val="1"/>
+      <w:numFmt w:val="decimal"/>
+      <w:lvlText w:val="%7."/>
+      <w:lvlJc w:val="left"/>
+      <w:pPr>
+        <w:tabs>
+          <w:tab w:val="num" w:pos="5040"/>
+        </w:tabs>
+        <w:ind w:left="5040" w:hanging="360"/>
+      </w:pPr>
+    </w:lvl>
+    <w:lvl w:ilvl="7" w:tentative="1">
+      <w:start w:val="1"/>
+      <w:numFmt w:val="decimal"/>
+      <w:lvlText w:val="%8."/>
+      <w:lvlJc w:val="left"/>
+      <w:pPr>
+        <w:tabs>
+          <w:tab w:val="num" w:pos="5760"/>
+        </w:tabs>
+        <w:ind w:left="5760" w:hanging="360"/>
+      </w:pPr>
+    </w:lvl>
+    <w:lvl w:ilvl="8" w:tentative="1">
+      <w:start w:val="1"/>
+      <w:numFmt w:val="decimal"/>
+      <w:lvlText w:val="%9."/>
+      <w:lvlJc w:val="left"/>
+      <w:pPr>
+        <w:tabs>
+          <w:tab w:val="num" w:pos="6480"/>
+        </w:tabs>
+        <w:ind w:left="6480" w:hanging="360"/>
+      </w:pPr>
+    </w:lvl>
+  </w:abstractNum>
+  <w:abstractNum w:abstractNumId="3" w15:restartNumberingAfterBreak="0">
     <w:nsid w:val="51D801DF"/>
     <w:multiLevelType w:val="multilevel"/>
     <w:tmpl w:val="DFFC6EB6"/>
@@ -1106,7 +1718,16 @@
     </w:lvl>
   </w:abstractNum>
   <w:num w:numId="1">
+    <w:abstractNumId w:val="3"/>
+  </w:num>
+  <w:num w:numId="2">
     <w:abstractNumId w:val="0"/>
+  </w:num>
+  <w:num w:numId="3">
+    <w:abstractNumId w:val="1"/>
+  </w:num>
+  <w:num w:numId="4">
+    <w:abstractNumId w:val="2"/>
   </w:num>
 </w:numbering>
 </file>
@@ -1611,7 +2232,6 @@
     <w:name w:val="Normal (Web)"/>
     <w:basedOn w:val="Normal"/>
     <w:uiPriority w:val="99"/>
-    <w:semiHidden/>
     <w:unhideWhenUsed/>
     <w:rsid w:val="0060725B"/>
     <w:pPr>

</xml_diff>